<commit_message>
all modules now have test reports
</commit_message>
<xml_diff>
--- a/Analog-Signal-Components/PAX/PAM-2025/PAM-modules/detector-module/detector-module-v2/Jan26_production/Test reports/module004_report.docx
+++ b/Analog-Signal-Components/PAX/PAM-2025/PAM-modules/detector-module/detector-module-v2/Jan26_production/Test reports/module004_report.docx
@@ -120,7 +120,33 @@
     </w:p>
     <w:p>
       <w:r>
-        <w:t>No power during P-V tests. Needs rework!</w:t>
+        <w:t xml:space="preserve">Needs a lid. </w:t>
+      </w:r>
+    </w:p>
+    <w:p>
+      <w:r>
+        <w:t xml:space="preserve">P-V </w:t>
+      </w:r>
+      <w:proofErr w:type="spellStart"/>
+      <w:r>
+        <w:t>quicktests</w:t>
+      </w:r>
+      <w:proofErr w:type="spellEnd"/>
+      <w:r>
+        <w:t xml:space="preserve"> showed constant 4mV output voltage regardless of input power and frequency.</w:t>
+      </w:r>
+    </w:p>
+    <w:p>
+      <w:r>
+        <w:t xml:space="preserve">S11 measurement looks like impedance issue (relatively flat, sloping from 0dB to -5dB with no significant features, looks </w:t>
+      </w:r>
+      <w:proofErr w:type="gramStart"/>
+      <w:r>
+        <w:t>similar to</w:t>
+      </w:r>
+      <w:proofErr w:type="gramEnd"/>
+      <w:r>
+        <w:t xml:space="preserve"> S11 measurement of noise with no device under test).</w:t>
       </w:r>
     </w:p>
     <w:p/>
@@ -219,6 +245,17 @@
           <w:tab w:val="left" w:pos="4860"/>
         </w:tabs>
       </w:pPr>
+      <w:r>
+        <w:t xml:space="preserve">No P-V curve due to failing </w:t>
+      </w:r>
+      <w:proofErr w:type="spellStart"/>
+      <w:r>
+        <w:t>quicktests</w:t>
+      </w:r>
+      <w:proofErr w:type="spellEnd"/>
+      <w:r>
+        <w:t>.</w:t>
+      </w:r>
     </w:p>
     <w:p>
       <w:pPr>
@@ -279,6 +316,50 @@
           <w:szCs w:val="28"/>
         </w:rPr>
       </w:pPr>
+      <w:r>
+        <w:rPr>
+          <w:b/>
+          <w:bCs/>
+          <w:noProof/>
+          <w:sz w:val="28"/>
+          <w:szCs w:val="28"/>
+        </w:rPr>
+        <w:drawing>
+          <wp:inline distT="0" distB="0" distL="0" distR="0" wp14:anchorId="2A576F89" wp14:editId="11DDE224">
+            <wp:extent cx="5972810" cy="4778375"/>
+            <wp:effectExtent l="0" t="0" r="0" b="0"/>
+            <wp:docPr id="241095890" name="Picture 1"/>
+            <wp:cNvGraphicFramePr>
+              <a:graphicFrameLocks xmlns:a="http://schemas.openxmlformats.org/drawingml/2006/main" noChangeAspect="1"/>
+            </wp:cNvGraphicFramePr>
+            <a:graphic xmlns:a="http://schemas.openxmlformats.org/drawingml/2006/main">
+              <a:graphicData uri="http://schemas.openxmlformats.org/drawingml/2006/picture">
+                <pic:pic xmlns:pic="http://schemas.openxmlformats.org/drawingml/2006/picture">
+                  <pic:nvPicPr>
+                    <pic:cNvPr id="241095890" name="Picture 241095890"/>
+                    <pic:cNvPicPr/>
+                  </pic:nvPicPr>
+                  <pic:blipFill>
+                    <a:blip r:embed="rId5"/>
+                    <a:stretch>
+                      <a:fillRect/>
+                    </a:stretch>
+                  </pic:blipFill>
+                  <pic:spPr>
+                    <a:xfrm>
+                      <a:off x="0" y="0"/>
+                      <a:ext cx="5972810" cy="4778375"/>
+                    </a:xfrm>
+                    <a:prstGeom prst="rect">
+                      <a:avLst/>
+                    </a:prstGeom>
+                  </pic:spPr>
+                </pic:pic>
+              </a:graphicData>
+            </a:graphic>
+          </wp:inline>
+        </w:drawing>
+      </w:r>
       <w:r>
         <w:rPr>
           <w:b/>
@@ -329,7 +410,7 @@
                     <pic:cNvPicPr/>
                   </pic:nvPicPr>
                   <pic:blipFill>
-                    <a:blip r:embed="rId5" cstate="print">
+                    <a:blip r:embed="rId6" cstate="print">
                       <a:extLst>
                         <a:ext uri="{28A0092B-C50C-407E-A947-70E740481C1C}">
                           <a14:useLocalDpi xmlns:a14="http://schemas.microsoft.com/office/drawing/2010/main" val="0"/>
@@ -523,7 +604,7 @@
           <w:noProof/>
         </w:rPr>
         <w:drawing>
-          <wp:anchor distT="0" distB="0" distL="114300" distR="114300" simplePos="0" relativeHeight="251664384" behindDoc="0" locked="0" layoutInCell="1" allowOverlap="1" wp14:anchorId="6F775B1C" wp14:editId="30F34C7D">
+          <wp:anchor distT="0" distB="0" distL="114300" distR="114300" simplePos="0" relativeHeight="251664384" behindDoc="0" locked="0" layoutInCell="1" allowOverlap="1" wp14:anchorId="6F775B1C" wp14:editId="157A4B10">
             <wp:simplePos x="0" y="0"/>
             <wp:positionH relativeFrom="column">
               <wp:posOffset>4008491</wp:posOffset>
@@ -546,7 +627,7 @@
                     <pic:cNvPicPr/>
                   </pic:nvPicPr>
                   <pic:blipFill>
-                    <a:blip r:embed="rId6" cstate="print">
+                    <a:blip r:embed="rId7" cstate="print">
                       <a:extLst>
                         <a:ext uri="{28A0092B-C50C-407E-A947-70E740481C1C}">
                           <a14:useLocalDpi xmlns:a14="http://schemas.microsoft.com/office/drawing/2010/main" val="0"/>
@@ -1010,7 +1091,7 @@
           <w:szCs w:val="28"/>
         </w:rPr>
         <w:drawing>
-          <wp:anchor distT="0" distB="0" distL="114300" distR="114300" simplePos="0" relativeHeight="251666432" behindDoc="1" locked="0" layoutInCell="1" allowOverlap="1" wp14:anchorId="7B5D8638" wp14:editId="3A859008">
+          <wp:anchor distT="0" distB="0" distL="114300" distR="114300" simplePos="0" relativeHeight="251666432" behindDoc="1" locked="0" layoutInCell="1" allowOverlap="1" wp14:anchorId="7B5D8638" wp14:editId="2DCC6638">
             <wp:simplePos x="0" y="0"/>
             <wp:positionH relativeFrom="column">
               <wp:posOffset>4004310</wp:posOffset>
@@ -1033,7 +1114,7 @@
                     <pic:cNvPicPr/>
                   </pic:nvPicPr>
                   <pic:blipFill>
-                    <a:blip r:embed="rId7" cstate="print">
+                    <a:blip r:embed="rId8" cstate="print">
                       <a:extLst>
                         <a:ext uri="{28A0092B-C50C-407E-A947-70E740481C1C}">
                           <a14:useLocalDpi xmlns:a14="http://schemas.microsoft.com/office/drawing/2010/main" val="0"/>

</xml_diff>